<commit_message>
Add calibration & investigation agents and docs
Introduce two new edge-agent components and update documentation: add agent/calibration_agent.py (self-calibrating agent capturing 2s ambient baseline, environment classification, and dynamic threshold/false-positive tuning) and agent/investigation_agent.py (multi-turn investigation scheduling +10s/+30s/+60s follow-ups and final threat verdicts). Update DOCUMENTATION.md and README.md to document the new agents, add CLI flags (--calibrate, --investigations) and a demo workflow, and refresh corresponding .docx files. New modules include usage docstrings for integration with fast_run.py and demo.py.
</commit_message>
<xml_diff>
--- a/DOCUMENTATION.docx
+++ b/DOCUMENTATION.docx
@@ -8735,6 +8735,605 @@
           <w:sz w:val="22"/>
         </w:rPr>
         <w:t xml:space="preserve"> logs back to the Triage Agent.</w:t>
+      </w:r>
+    </w:p>
+    <w:p/>
+    <w:p>
+      <w:pPr>
+        <w:pStyle w:val="Heading3"/>
+        <w:keepNext/>
+        <w:spacing w:before="160" w:after="40"/>
+      </w:pPr>
+      <w:r>
+        <w:rPr>
+          <w:rFonts w:ascii="Times New Roman" w:hAnsi="Times New Roman"/>
+          <w:b/>
+          <w:i w:val="0"/>
+          <w:color w:val="000000"/>
+          <w:sz w:val="24"/>
+        </w:rPr>
+        <w:t>Self-Calibrating Agent (CalibrationAgent)</w:t>
+      </w:r>
+    </w:p>
+    <w:p/>
+    <w:p>
+      <w:pPr>
+        <w:spacing w:line="276" w:lineRule="auto" w:after="120" w:before="0"/>
+        <w:jc w:val="both"/>
+      </w:pPr>
+      <w:r>
+        <w:rPr>
+          <w:rFonts w:ascii="Times New Roman" w:hAnsi="Times New Roman"/>
+          <w:b w:val="0"/>
+          <w:i w:val="0"/>
+          <w:color w:val="000000"/>
+          <w:sz w:val="22"/>
+        </w:rPr>
+        <w:t>The Calibration Agent (</w:t>
+      </w:r>
+      <w:r>
+        <w:rPr>
+          <w:rFonts w:ascii="Consolas" w:hAnsi="Consolas"/>
+          <w:color w:val="595959"/>
+          <w:sz w:val="19"/>
+        </w:rPr>
+        <w:t>agent/calibration_agent.py</w:t>
+      </w:r>
+      <w:r>
+        <w:rPr>
+          <w:rFonts w:ascii="Times New Roman" w:hAnsi="Times New Roman"/>
+          <w:b w:val="0"/>
+          <w:i w:val="0"/>
+          <w:color w:val="000000"/>
+          <w:sz w:val="22"/>
+        </w:rPr>
+        <w:t>) optimizes system thresholds dynamically for the specific deployment environment:</w:t>
+      </w:r>
+    </w:p>
+    <w:p>
+      <w:pPr>
+        <w:pStyle w:val="ListNumber"/>
+        <w:spacing w:after="40" w:before="0"/>
+      </w:pPr>
+      <w:r>
+        <w:rPr>
+          <w:rFonts w:ascii="Times New Roman" w:hAnsi="Times New Roman"/>
+          <w:b/>
+          <w:i w:val="0"/>
+          <w:color w:val="000000"/>
+          <w:sz w:val="22"/>
+        </w:rPr>
+        <w:t>Baseline Capture</w:t>
+      </w:r>
+      <w:r>
+        <w:rPr>
+          <w:rFonts w:ascii="Times New Roman" w:hAnsi="Times New Roman"/>
+          <w:b w:val="0"/>
+          <w:i w:val="0"/>
+          <w:color w:val="000000"/>
+          <w:sz w:val="22"/>
+        </w:rPr>
+        <w:t>: At startup, it records a short 2-second audio window of ambient noise.</w:t>
+      </w:r>
+    </w:p>
+    <w:p>
+      <w:pPr>
+        <w:pStyle w:val="ListNumber"/>
+        <w:spacing w:after="40" w:before="0"/>
+      </w:pPr>
+      <w:r>
+        <w:rPr>
+          <w:rFonts w:ascii="Times New Roman" w:hAnsi="Times New Roman"/>
+          <w:b/>
+          <w:i w:val="0"/>
+          <w:color w:val="000000"/>
+          <w:sz w:val="22"/>
+        </w:rPr>
+        <w:t>Environment Classification</w:t>
+      </w:r>
+      <w:r>
+        <w:rPr>
+          <w:rFonts w:ascii="Times New Roman" w:hAnsi="Times New Roman"/>
+          <w:b w:val="0"/>
+          <w:i w:val="0"/>
+          <w:color w:val="000000"/>
+          <w:sz w:val="22"/>
+        </w:rPr>
+        <w:t>: Runs lightweight tasks to classify the environment into one of five categories:</w:t>
+      </w:r>
+    </w:p>
+    <w:p>
+      <w:pPr>
+        <w:pStyle w:val="ListBullet"/>
+        <w:spacing w:after="40" w:before="0"/>
+        <w:ind w:left="567"/>
+      </w:pPr>
+      <w:r>
+        <w:rPr>
+          <w:rFonts w:ascii="Consolas" w:hAnsi="Consolas"/>
+          <w:color w:val="595959"/>
+          <w:sz w:val="19"/>
+        </w:rPr>
+        <w:t>silent_room</w:t>
+      </w:r>
+      <w:r>
+        <w:rPr>
+          <w:rFonts w:ascii="Times New Roman" w:hAnsi="Times New Roman"/>
+          <w:b w:val="0"/>
+          <w:i w:val="0"/>
+          <w:color w:val="000000"/>
+          <w:sz w:val="22"/>
+        </w:rPr>
+        <w:t xml:space="preserve"> (ultra-low ambient noise)</w:t>
+      </w:r>
+    </w:p>
+    <w:p>
+      <w:pPr>
+        <w:pStyle w:val="ListBullet"/>
+        <w:spacing w:after="40" w:before="0"/>
+        <w:ind w:left="567"/>
+      </w:pPr>
+      <w:r>
+        <w:rPr>
+          <w:rFonts w:ascii="Consolas" w:hAnsi="Consolas"/>
+          <w:color w:val="595959"/>
+          <w:sz w:val="19"/>
+        </w:rPr>
+        <w:t>office</w:t>
+      </w:r>
+      <w:r>
+        <w:rPr>
+          <w:rFonts w:ascii="Times New Roman" w:hAnsi="Times New Roman"/>
+          <w:b w:val="0"/>
+          <w:i w:val="0"/>
+          <w:color w:val="000000"/>
+          <w:sz w:val="22"/>
+        </w:rPr>
+        <w:t xml:space="preserve"> (moderate ambient noise, keyboard taps)</w:t>
+      </w:r>
+    </w:p>
+    <w:p>
+      <w:pPr>
+        <w:pStyle w:val="ListBullet"/>
+        <w:spacing w:after="40" w:before="0"/>
+        <w:ind w:left="567"/>
+      </w:pPr>
+      <w:r>
+        <w:rPr>
+          <w:rFonts w:ascii="Consolas" w:hAnsi="Consolas"/>
+          <w:color w:val="595959"/>
+          <w:sz w:val="19"/>
+        </w:rPr>
+        <w:t>outdoor</w:t>
+      </w:r>
+      <w:r>
+        <w:rPr>
+          <w:rFonts w:ascii="Times New Roman" w:hAnsi="Times New Roman"/>
+          <w:b w:val="0"/>
+          <w:i w:val="0"/>
+          <w:color w:val="000000"/>
+          <w:sz w:val="22"/>
+        </w:rPr>
+        <w:t xml:space="preserve"> (wind, weather, street traffic)</w:t>
+      </w:r>
+    </w:p>
+    <w:p>
+      <w:pPr>
+        <w:pStyle w:val="ListBullet"/>
+        <w:spacing w:after="40" w:before="0"/>
+        <w:ind w:left="567"/>
+      </w:pPr>
+      <w:r>
+        <w:rPr>
+          <w:rFonts w:ascii="Consolas" w:hAnsi="Consolas"/>
+          <w:color w:val="595959"/>
+          <w:sz w:val="19"/>
+        </w:rPr>
+        <w:t>industrial</w:t>
+      </w:r>
+      <w:r>
+        <w:rPr>
+          <w:rFonts w:ascii="Times New Roman" w:hAnsi="Times New Roman"/>
+          <w:b w:val="0"/>
+          <w:i w:val="0"/>
+          <w:color w:val="000000"/>
+          <w:sz w:val="22"/>
+        </w:rPr>
+        <w:t xml:space="preserve"> (moderate warehouse/factory hums)</w:t>
+      </w:r>
+    </w:p>
+    <w:p>
+      <w:pPr>
+        <w:pStyle w:val="ListBullet"/>
+        <w:spacing w:after="40" w:before="0"/>
+        <w:ind w:left="567"/>
+      </w:pPr>
+      <w:r>
+        <w:rPr>
+          <w:rFonts w:ascii="Consolas" w:hAnsi="Consolas"/>
+          <w:color w:val="595959"/>
+          <w:sz w:val="19"/>
+        </w:rPr>
+        <w:t>machinery_heavy</w:t>
+      </w:r>
+      <w:r>
+        <w:rPr>
+          <w:rFonts w:ascii="Times New Roman" w:hAnsi="Times New Roman"/>
+          <w:b w:val="0"/>
+          <w:i w:val="0"/>
+          <w:color w:val="000000"/>
+          <w:sz w:val="22"/>
+        </w:rPr>
+        <w:t xml:space="preserve"> (constant industrial engines, high decibel background)</w:t>
+      </w:r>
+    </w:p>
+    <w:p>
+      <w:pPr>
+        <w:pStyle w:val="ListNumber"/>
+        <w:spacing w:after="40" w:before="0"/>
+      </w:pPr>
+      <w:r>
+        <w:rPr>
+          <w:rFonts w:ascii="Times New Roman" w:hAnsi="Times New Roman"/>
+          <w:b/>
+          <w:i w:val="0"/>
+          <w:color w:val="000000"/>
+          <w:sz w:val="22"/>
+        </w:rPr>
+        <w:t>Threshold Calibration</w:t>
+      </w:r>
+      <w:r>
+        <w:rPr>
+          <w:rFonts w:ascii="Times New Roman" w:hAnsi="Times New Roman"/>
+          <w:b w:val="0"/>
+          <w:i w:val="0"/>
+          <w:color w:val="000000"/>
+          <w:sz w:val="22"/>
+        </w:rPr>
+        <w:t>: Configures environment-specific initial thresholds for VAD speech ratio, anomaly score sensitivity, SNR alert triggers, and impulse energy spike levels.</w:t>
+      </w:r>
+    </w:p>
+    <w:p>
+      <w:pPr>
+        <w:pStyle w:val="ListNumber"/>
+        <w:spacing w:after="40" w:before="0"/>
+      </w:pPr>
+      <w:r>
+        <w:rPr>
+          <w:rFonts w:ascii="Times New Roman" w:hAnsi="Times New Roman"/>
+          <w:b/>
+          <w:i w:val="0"/>
+          <w:color w:val="000000"/>
+          <w:sz w:val="22"/>
+        </w:rPr>
+        <w:t>False Positive Tuning</w:t>
+      </w:r>
+      <w:r>
+        <w:rPr>
+          <w:rFonts w:ascii="Times New Roman" w:hAnsi="Times New Roman"/>
+          <w:b w:val="0"/>
+          <w:i w:val="0"/>
+          <w:color w:val="000000"/>
+          <w:sz w:val="22"/>
+        </w:rPr>
+        <w:t>: Tracks false positive rates over a sliding history window (last 20 events per signal). If the false positive rate for a risk signal exceeds 40%, the agent raises the threshold (making it less sensitive). If the false positive rate drops below 5%, the agent lowers the threshold (making it more sensitive).</w:t>
+      </w:r>
+    </w:p>
+    <w:p/>
+    <w:p>
+      <w:pPr>
+        <w:pStyle w:val="Heading3"/>
+        <w:keepNext/>
+        <w:spacing w:before="160" w:after="40"/>
+      </w:pPr>
+      <w:r>
+        <w:rPr>
+          <w:rFonts w:ascii="Times New Roman" w:hAnsi="Times New Roman"/>
+          <w:b/>
+          <w:i w:val="0"/>
+          <w:color w:val="000000"/>
+          <w:sz w:val="24"/>
+        </w:rPr>
+        <w:t>Multi-Turn Incident Investigation (InvestigationAgent)</w:t>
+      </w:r>
+    </w:p>
+    <w:p/>
+    <w:p>
+      <w:pPr>
+        <w:spacing w:line="276" w:lineRule="auto" w:after="120" w:before="0"/>
+        <w:jc w:val="both"/>
+      </w:pPr>
+      <w:r>
+        <w:rPr>
+          <w:rFonts w:ascii="Times New Roman" w:hAnsi="Times New Roman"/>
+          <w:b w:val="0"/>
+          <w:i w:val="0"/>
+          <w:color w:val="000000"/>
+          <w:sz w:val="22"/>
+        </w:rPr>
+        <w:t>To eliminate false alarms and confirm high-priority events, the Multi-Turn Investigation Agent (</w:t>
+      </w:r>
+      <w:r>
+        <w:rPr>
+          <w:rFonts w:ascii="Consolas" w:hAnsi="Consolas"/>
+          <w:color w:val="595959"/>
+          <w:sz w:val="19"/>
+        </w:rPr>
+        <w:t>agent/investigation_agent.py</w:t>
+      </w:r>
+      <w:r>
+        <w:rPr>
+          <w:rFonts w:ascii="Times New Roman" w:hAnsi="Times New Roman"/>
+          <w:b w:val="0"/>
+          <w:i w:val="0"/>
+          <w:color w:val="000000"/>
+          <w:sz w:val="22"/>
+        </w:rPr>
+        <w:t>) manages a stateful event-timeline loop:</w:t>
+      </w:r>
+    </w:p>
+    <w:p>
+      <w:pPr>
+        <w:pStyle w:val="ListNumber"/>
+        <w:spacing w:after="40" w:before="0"/>
+      </w:pPr>
+      <w:r>
+        <w:rPr>
+          <w:rFonts w:ascii="Times New Roman" w:hAnsi="Times New Roman"/>
+          <w:b/>
+          <w:i w:val="0"/>
+          <w:color w:val="000000"/>
+          <w:sz w:val="22"/>
+        </w:rPr>
+        <w:t>Trigger Check</w:t>
+      </w:r>
+      <w:r>
+        <w:rPr>
+          <w:rFonts w:ascii="Times New Roman" w:hAnsi="Times New Roman"/>
+          <w:b w:val="0"/>
+          <w:i w:val="0"/>
+          <w:color w:val="000000"/>
+          <w:sz w:val="22"/>
+        </w:rPr>
+        <w:t>: When the orchestrator decides a HIGH priority event has occurred (e.g. possible safety incident or impulse threat), it opens a new investigation tracking timeline.</w:t>
+      </w:r>
+    </w:p>
+    <w:p>
+      <w:pPr>
+        <w:pStyle w:val="ListNumber"/>
+        <w:spacing w:after="40" w:before="0"/>
+      </w:pPr>
+      <w:r>
+        <w:rPr>
+          <w:rFonts w:ascii="Times New Roman" w:hAnsi="Times New Roman"/>
+          <w:b/>
+          <w:i w:val="0"/>
+          <w:color w:val="000000"/>
+          <w:sz w:val="22"/>
+        </w:rPr>
+        <w:t>Follow-up Scheduling</w:t>
+      </w:r>
+      <w:r>
+        <w:rPr>
+          <w:rFonts w:ascii="Times New Roman" w:hAnsi="Times New Roman"/>
+          <w:b w:val="0"/>
+          <w:i w:val="0"/>
+          <w:color w:val="000000"/>
+          <w:sz w:val="22"/>
+        </w:rPr>
+        <w:t xml:space="preserve">: Schedules background audio clip recordings at offsets of </w:t>
+      </w:r>
+      <w:r>
+        <w:rPr>
+          <w:rFonts w:ascii="Times New Roman" w:hAnsi="Times New Roman"/>
+          <w:b/>
+          <w:i w:val="0"/>
+          <w:color w:val="000000"/>
+          <w:sz w:val="22"/>
+        </w:rPr>
+        <w:t>+10s</w:t>
+      </w:r>
+      <w:r>
+        <w:rPr>
+          <w:rFonts w:ascii="Times New Roman" w:hAnsi="Times New Roman"/>
+          <w:b w:val="0"/>
+          <w:i w:val="0"/>
+          <w:color w:val="000000"/>
+          <w:sz w:val="22"/>
+        </w:rPr>
+        <w:t xml:space="preserve">, </w:t>
+      </w:r>
+      <w:r>
+        <w:rPr>
+          <w:rFonts w:ascii="Times New Roman" w:hAnsi="Times New Roman"/>
+          <w:b/>
+          <w:i w:val="0"/>
+          <w:color w:val="000000"/>
+          <w:sz w:val="22"/>
+        </w:rPr>
+        <w:t>+30s</w:t>
+      </w:r>
+      <w:r>
+        <w:rPr>
+          <w:rFonts w:ascii="Times New Roman" w:hAnsi="Times New Roman"/>
+          <w:b w:val="0"/>
+          <w:i w:val="0"/>
+          <w:color w:val="000000"/>
+          <w:sz w:val="22"/>
+        </w:rPr>
+        <w:t xml:space="preserve">, and </w:t>
+      </w:r>
+      <w:r>
+        <w:rPr>
+          <w:rFonts w:ascii="Times New Roman" w:hAnsi="Times New Roman"/>
+          <w:b/>
+          <w:i w:val="0"/>
+          <w:color w:val="000000"/>
+          <w:sz w:val="22"/>
+        </w:rPr>
+        <w:t>+60s</w:t>
+      </w:r>
+      <w:r>
+        <w:rPr>
+          <w:rFonts w:ascii="Times New Roman" w:hAnsi="Times New Roman"/>
+          <w:b w:val="0"/>
+          <w:i w:val="0"/>
+          <w:color w:val="000000"/>
+          <w:sz w:val="22"/>
+        </w:rPr>
+        <w:t xml:space="preserve"> from the trigger.</w:t>
+      </w:r>
+    </w:p>
+    <w:p>
+      <w:pPr>
+        <w:pStyle w:val="ListNumber"/>
+        <w:spacing w:after="40" w:before="0"/>
+      </w:pPr>
+      <w:r>
+        <w:rPr>
+          <w:rFonts w:ascii="Times New Roman" w:hAnsi="Times New Roman"/>
+          <w:b/>
+          <w:i w:val="0"/>
+          <w:color w:val="000000"/>
+          <w:sz w:val="22"/>
+        </w:rPr>
+        <w:t>Comparative Verification</w:t>
+      </w:r>
+      <w:r>
+        <w:rPr>
+          <w:rFonts w:ascii="Times New Roman" w:hAnsi="Times New Roman"/>
+          <w:b w:val="0"/>
+          <w:i w:val="0"/>
+          <w:color w:val="000000"/>
+          <w:sz w:val="22"/>
+        </w:rPr>
+        <w:t>: Compares each follow-up decision's active risk signals against the initial trigger (computing confidence differences and tracing active risk trends).</w:t>
+      </w:r>
+    </w:p>
+    <w:p>
+      <w:pPr>
+        <w:pStyle w:val="ListNumber"/>
+        <w:spacing w:after="40" w:before="0"/>
+      </w:pPr>
+      <w:r>
+        <w:rPr>
+          <w:rFonts w:ascii="Times New Roman" w:hAnsi="Times New Roman"/>
+          <w:b/>
+          <w:i w:val="0"/>
+          <w:color w:val="000000"/>
+          <w:sz w:val="22"/>
+        </w:rPr>
+        <w:t>Verdict Formulation</w:t>
+      </w:r>
+      <w:r>
+        <w:rPr>
+          <w:rFonts w:ascii="Times New Roman" w:hAnsi="Times New Roman"/>
+          <w:b w:val="0"/>
+          <w:i w:val="0"/>
+          <w:color w:val="000000"/>
+          <w:sz w:val="22"/>
+        </w:rPr>
+        <w:t>: Once all three follow-ups are completed, it evaluates the timeline to produce a threat verdict:</w:t>
+      </w:r>
+    </w:p>
+    <w:p>
+      <w:pPr>
+        <w:pStyle w:val="ListBullet"/>
+        <w:spacing w:after="40" w:before="0"/>
+        <w:ind w:left="567"/>
+      </w:pPr>
+      <w:r>
+        <w:rPr>
+          <w:rFonts w:ascii="Consolas" w:hAnsi="Consolas"/>
+          <w:color w:val="595959"/>
+          <w:sz w:val="19"/>
+        </w:rPr>
+        <w:t>threat_confirmed</w:t>
+      </w:r>
+      <w:r>
+        <w:rPr>
+          <w:rFonts w:ascii="Times New Roman" w:hAnsi="Times New Roman"/>
+          <w:b w:val="0"/>
+          <w:i w:val="0"/>
+          <w:color w:val="000000"/>
+          <w:sz w:val="22"/>
+        </w:rPr>
+        <w:t xml:space="preserve"> (the risk signals persisted across 2 or more follow-up windows)</w:t>
+      </w:r>
+    </w:p>
+    <w:p>
+      <w:pPr>
+        <w:pStyle w:val="ListBullet"/>
+        <w:spacing w:after="40" w:before="0"/>
+        <w:ind w:left="567"/>
+      </w:pPr>
+      <w:r>
+        <w:rPr>
+          <w:rFonts w:ascii="Consolas" w:hAnsi="Consolas"/>
+          <w:color w:val="595959"/>
+          <w:sz w:val="19"/>
+        </w:rPr>
+        <w:t>threat_resolved</w:t>
+      </w:r>
+      <w:r>
+        <w:rPr>
+          <w:rFonts w:ascii="Times New Roman" w:hAnsi="Times New Roman"/>
+          <w:b w:val="0"/>
+          <w:i w:val="0"/>
+          <w:color w:val="000000"/>
+          <w:sz w:val="22"/>
+        </w:rPr>
+        <w:t xml:space="preserve"> (the threat signal was confirmed in only 1 window and cleared in the final window)</w:t>
+      </w:r>
+    </w:p>
+    <w:p>
+      <w:pPr>
+        <w:pStyle w:val="ListBullet"/>
+        <w:spacing w:after="40" w:before="0"/>
+        <w:ind w:left="567"/>
+      </w:pPr>
+      <w:r>
+        <w:rPr>
+          <w:rFonts w:ascii="Consolas" w:hAnsi="Consolas"/>
+          <w:color w:val="595959"/>
+          <w:sz w:val="19"/>
+        </w:rPr>
+        <w:t>false_alarm</w:t>
+      </w:r>
+      <w:r>
+        <w:rPr>
+          <w:rFonts w:ascii="Times New Roman" w:hAnsi="Times New Roman"/>
+          <w:b w:val="0"/>
+          <w:i w:val="0"/>
+          <w:color w:val="000000"/>
+          <w:sz w:val="22"/>
+        </w:rPr>
+        <w:t xml:space="preserve"> (no follow-ups confirmed the threat; triggers dynamic threshold tuning in CalibrationAgent)</w:t>
+      </w:r>
+    </w:p>
+    <w:p>
+      <w:pPr>
+        <w:pStyle w:val="ListBullet"/>
+        <w:spacing w:after="40" w:before="0"/>
+        <w:ind w:left="567"/>
+      </w:pPr>
+      <w:r>
+        <w:rPr>
+          <w:rFonts w:ascii="Consolas" w:hAnsi="Consolas"/>
+          <w:color w:val="595959"/>
+          <w:sz w:val="19"/>
+        </w:rPr>
+        <w:t>inconclusive</w:t>
+      </w:r>
+      <w:r>
+        <w:rPr>
+          <w:rFonts w:ascii="Times New Roman" w:hAnsi="Times New Roman"/>
+          <w:b w:val="0"/>
+          <w:i w:val="0"/>
+          <w:color w:val="000000"/>
+          <w:sz w:val="22"/>
+        </w:rPr>
+        <w:t xml:space="preserve"> (insufficient data/recording errors)</w:t>
       </w:r>
     </w:p>
     <w:p/>

</xml_diff>